<commit_message>
docs: align filming guide with four advantages and real screenshots
</commit_message>
<xml_diff>
--- a/docs/presentation/比赛视频拍摄指导_3分钟.docx
+++ b/docs/presentation/比赛视频拍摄指导_3分钟.docx
@@ -22,7 +22,7 @@
     </w:p>
     <w:p>
       <w:r>
-        <w:t>本指导用于拍摄比赛作品介绍。按“政策契合、功能对比、技术工具、经济优势”的顺序完成180秒成片，最多不超过240秒。每段给出PPT页码、画面停留时间、操作步骤和可直接朗读的讲解词。建议以屏幕录制为主，讲解配音为辅。</w:t>
+        <w:t>本指导用于拍摄比赛作品介绍。按“政策契合、功能对比、技术工具、作品优势”的顺序完成180秒成片，最多不超过240秒。每段给出PPT页码、画面停留时间、操作步骤和可直接朗读的讲解词。建议以屏幕录制为主，讲解配音为辅。</w:t>
       </w:r>
     </w:p>
     <w:p>
@@ -1427,7 +1427,7 @@
                 <w:b w:val="0"/>
                 <w:sz w:val="18"/>
               </w:rPr>
-              <w:t>经济性与推广优势</w:t>
+              <w:t>作品优势与推广价值</w:t>
             </w:r>
           </w:p>
         </w:tc>
@@ -1924,7 +1924,7 @@
         <w:pStyle w:val="Heading2"/>
       </w:pPr>
       <w:r>
-        <w:t>9 经济性与推广优势</w:t>
+        <w:t>9 作品优势与推广价值</w:t>
       </w:r>
     </w:p>
     <w:p>
@@ -1946,7 +1946,7 @@
         <w:t xml:space="preserve">画面与停留  </w:t>
       </w:r>
       <w:r>
-        <w:t>158至176秒展示PPT第9页，逐行讲成本来源；176至180秒保留结尾，最后2秒不讲话。</w:t>
+        <w:t>158至176秒展示PPT第9页，按左上、右上、左下、右下依次讲四项优势，每项约4至5秒；176至180秒保留结束画面。</w:t>
       </w:r>
     </w:p>
     <w:p>
@@ -1957,7 +1957,7 @@
         <w:t xml:space="preserve">操作与字幕  </w:t>
       </w:r>
       <w:r>
-        <w:t>不虚构节电率、节省金额或盈利数据。补充口径：当前为原型，推广前需完成账号隔离、鉴权与真实设备适配。</w:t>
+        <w:t>四项优势分别配费用、交互、记录和设置图标。描述架构特点，不报未验证的节省金额、效率提升率或节电率。</w:t>
       </w:r>
     </w:p>
     <w:p>
@@ -1968,7 +1968,7 @@
         <w:t xml:space="preserve">讲解词  </w:t>
       </w:r>
       <w:r>
-        <w:t>经济性方面，浏览器可以复用现有终端，一套Web界面便于维护；调用现有模型，也省去自建训练环节。后续成本仍包括模型调用、托管和硬件适配。作品适合先做小范围试点，再验证推广价值。</w:t>
+        <w:t>作品有四方面优势：复用现有终端，控制投入；文字语音并用，操作方便；状态与记录可查看，管理直观；Web模块统一维护，便于扩展。后续仍需验证使用效果，并完善硬件接入和用户隔离。</w:t>
       </w:r>
     </w:p>
     <w:p>
@@ -3005,12 +3005,12 @@
         <w:pStyle w:val="Heading1"/>
       </w:pPr>
       <w:r>
-        <w:t>经济优势的表达边界</w:t>
+        <w:t>作品优势的表达边界</w:t>
       </w:r>
     </w:p>
     <w:p>
       <w:r>
-        <w:t>复用浏览器终端、统一Web代码与调用现有模型属于架构层面的定性优势。尚无完整预算、用户对照实验或硬件能耗测量，因此不写降低成本百分比、已实现节能或盈利承诺。后续试点可记录部署费用、调用量、操作完成率与使用满意度。</w:t>
+        <w:t>经济性、操作便利、管理直观与易维护扩展均依据当前功能和架构归纳。复用浏览器终端、统一Web代码与调用现有模型属于定性成本优势。尚无完整预算、用户对照实验或硬件能耗测量，因此不写降低成本百分比、已实现节能或盈利承诺。后续试点可记录部署费用、调用量、操作完成率与使用满意度。</w:t>
       </w:r>
     </w:p>
     <w:p>
@@ -3023,7 +3023,7 @@
     </w:p>
     <w:p>
       <w:r>
-        <w:t>截图由隔离运行实例生成，未读取原有.data数据。任务截图通过现有任务API建立演示提醒，报告截图只含演示事件。设置与数字管家保留未验证状态，天气截图保留当时的获取失败提示。正式比赛应按前述步骤重录真实可用链路。</w:t>
+        <w:t>截图由隔离运行实例生成，未读取原有.data数据。任务截图通过现有任务API建立20秒演示提醒，并真实等待到点；家电截图记录手动开关前后状态，报告截图只含本次演示事件。数字管家保留未验证状态，未伪造模型验证或天气数据。正式比赛应按前述步骤重录真实可用链路。</w:t>
       </w:r>
     </w:p>
     <w:sectPr>

</xml_diff>